<commit_message>
Upload updated port mapping with minor changes
</commit_message>
<xml_diff>
--- a/Documentation/Port_Mapping.docx
+++ b/Documentation/Port_Mapping.docx
@@ -422,7 +422,7 @@
               <w:rPr>
                 <w:rFonts w:ascii="Times New Roman" w:hAnsi="Times New Roman" w:cs="Times New Roman"/>
               </w:rPr>
-              <w:t>G0/2</w:t>
+              <w:t>Fa0/1</w:t>
             </w:r>
           </w:p>
         </w:tc>
@@ -532,7 +532,13 @@
               <w:rPr>
                 <w:rFonts w:ascii="Times New Roman" w:hAnsi="Times New Roman" w:cs="Times New Roman"/>
               </w:rPr>
-              <w:t>Fa0/24</w:t>
+              <w:t>Fa0/</w:t>
+            </w:r>
+            <w:r>
+              <w:rPr>
+                <w:rFonts w:ascii="Times New Roman" w:hAnsi="Times New Roman" w:cs="Times New Roman"/>
+              </w:rPr>
+              <w:t>2</w:t>
             </w:r>
           </w:p>
         </w:tc>
@@ -4746,6 +4752,7 @@
   <w:style w:type="character" w:default="1" w:styleId="DefaultParagraphFont">
     <w:name w:val="Default Paragraph Font"/>
     <w:uiPriority w:val="1"/>
+    <w:semiHidden/>
     <w:unhideWhenUsed/>
   </w:style>
   <w:style w:type="table" w:default="1" w:styleId="TableNormal">

</xml_diff>